<commit_message>
Site updated: 2020-10-10 21:30:13
</commit_message>
<xml_diff>
--- a/file/kaifawendang.docx
+++ b/file/kaifawendang.docx
@@ -164,6 +164,24 @@
           <w:szCs w:val="27"/>
         </w:rPr>
         <w:t>终端会返回一个目录，记住这个目录，等会有用</w:t>
+      </w:r>
+    </w:p>
+    <w:p>
+      <w:pPr>
+        <w:pStyle w:val="Normal"/>
+        <w:bidi w:val="0"/>
+        <w:jc w:val="left"/>
+        <w:rPr>
+          <w:sz w:val="27"/>
+          <w:szCs w:val="27"/>
+        </w:rPr>
+      </w:pPr>
+      <w:r>
+        <w:rPr>
+          <w:sz w:val="24"/>
+          <w:szCs w:val="27"/>
+        </w:rPr>
+        <w:t>（懒得更新了，下次在来吧。。。。）</w:t>
       </w:r>
     </w:p>
     <w:sectPr>

</xml_diff>

<commit_message>
Site updated: 2020-10-10 21:52:53
</commit_message>
<xml_diff>
--- a/file/kaifawendang.docx
+++ b/file/kaifawendang.docx
@@ -99,6 +99,57 @@
           <w:sz w:val="32"/>
           <w:szCs w:val="32"/>
         </w:rPr>
+        <w:drawing>
+          <wp:anchor behindDoc="0" distT="0" distB="0" distL="0" distR="0" simplePos="0" locked="0" layoutInCell="1" allowOverlap="1" relativeHeight="2">
+            <wp:simplePos x="0" y="0"/>
+            <wp:positionH relativeFrom="column">
+              <wp:posOffset>3117215</wp:posOffset>
+            </wp:positionH>
+            <wp:positionV relativeFrom="paragraph">
+              <wp:posOffset>93345</wp:posOffset>
+            </wp:positionV>
+            <wp:extent cx="2952750" cy="695325"/>
+            <wp:effectExtent l="0" t="0" r="0" b="0"/>
+            <wp:wrapSquare wrapText="largest"/>
+            <wp:docPr id="1" name="图像1" descr=""/>
+            <wp:cNvGraphicFramePr>
+              <a:graphicFrameLocks xmlns:a="http://schemas.openxmlformats.org/drawingml/2006/main" noChangeAspect="1"/>
+            </wp:cNvGraphicFramePr>
+            <a:graphic xmlns:a="http://schemas.openxmlformats.org/drawingml/2006/main">
+              <a:graphicData uri="http://schemas.openxmlformats.org/drawingml/2006/picture">
+                <pic:pic xmlns:pic="http://schemas.openxmlformats.org/drawingml/2006/picture">
+                  <pic:nvPicPr>
+                    <pic:cNvPr id="1" name="图像1" descr=""/>
+                    <pic:cNvPicPr>
+                      <a:picLocks noChangeAspect="1" noChangeArrowheads="1"/>
+                    </pic:cNvPicPr>
+                  </pic:nvPicPr>
+                  <pic:blipFill>
+                    <a:blip r:embed="rId2"/>
+                    <a:stretch>
+                      <a:fillRect/>
+                    </a:stretch>
+                  </pic:blipFill>
+                  <pic:spPr bwMode="auto">
+                    <a:xfrm>
+                      <a:off x="0" y="0"/>
+                      <a:ext cx="2952750" cy="695325"/>
+                    </a:xfrm>
+                    <a:prstGeom prst="rect">
+                      <a:avLst/>
+                    </a:prstGeom>
+                  </pic:spPr>
+                </pic:pic>
+              </a:graphicData>
+            </a:graphic>
+          </wp:anchor>
+        </w:drawing>
+      </w:r>
+      <w:r>
+        <w:rPr>
+          <w:sz w:val="32"/>
+          <w:szCs w:val="32"/>
+        </w:rPr>
         <w:t>webapps runpath</w:t>
       </w:r>
     </w:p>
@@ -159,29 +210,377 @@
         </w:rPr>
       </w:pPr>
       <w:r>
-        <w:rPr>
-          <w:sz w:val="24"/>
-          <w:szCs w:val="27"/>
-        </w:rPr>
-        <w:t>终端会返回一个目录，记住这个目录，等会有用</w:t>
-      </w:r>
-    </w:p>
-    <w:p>
-      <w:pPr>
-        <w:pStyle w:val="Normal"/>
-        <w:bidi w:val="0"/>
-        <w:jc w:val="left"/>
-        <w:rPr>
-          <w:sz w:val="27"/>
-          <w:szCs w:val="27"/>
-        </w:rPr>
-      </w:pPr>
-      <w:r>
-        <w:rPr>
-          <w:sz w:val="24"/>
-          <w:szCs w:val="27"/>
-        </w:rPr>
-        <w:t>（懒得更新了，下次在来吧。。。。）</w:t>
+        <w:rPr/>
+      </w:r>
+    </w:p>
+    <w:p>
+      <w:pPr>
+        <w:pStyle w:val="Normal"/>
+        <w:bidi w:val="0"/>
+        <w:jc w:val="left"/>
+        <w:rPr>
+          <w:sz w:val="27"/>
+          <w:szCs w:val="27"/>
+        </w:rPr>
+      </w:pPr>
+      <w:r>
+        <w:drawing>
+          <wp:anchor behindDoc="0" distT="0" distB="0" distL="0" distR="0" simplePos="0" locked="0" layoutInCell="1" allowOverlap="1" relativeHeight="3">
+            <wp:simplePos x="0" y="0"/>
+            <wp:positionH relativeFrom="column">
+              <wp:posOffset>3060065</wp:posOffset>
+            </wp:positionH>
+            <wp:positionV relativeFrom="paragraph">
+              <wp:posOffset>38100</wp:posOffset>
+            </wp:positionV>
+            <wp:extent cx="3638550" cy="704850"/>
+            <wp:effectExtent l="0" t="0" r="0" b="0"/>
+            <wp:wrapSquare wrapText="largest"/>
+            <wp:docPr id="2" name="图像2" descr=""/>
+            <wp:cNvGraphicFramePr>
+              <a:graphicFrameLocks xmlns:a="http://schemas.openxmlformats.org/drawingml/2006/main" noChangeAspect="1"/>
+            </wp:cNvGraphicFramePr>
+            <a:graphic xmlns:a="http://schemas.openxmlformats.org/drawingml/2006/main">
+              <a:graphicData uri="http://schemas.openxmlformats.org/drawingml/2006/picture">
+                <pic:pic xmlns:pic="http://schemas.openxmlformats.org/drawingml/2006/picture">
+                  <pic:nvPicPr>
+                    <pic:cNvPr id="2" name="图像2" descr=""/>
+                    <pic:cNvPicPr>
+                      <a:picLocks noChangeAspect="1" noChangeArrowheads="1"/>
+                    </pic:cNvPicPr>
+                  </pic:nvPicPr>
+                  <pic:blipFill>
+                    <a:blip r:embed="rId3"/>
+                    <a:stretch>
+                      <a:fillRect/>
+                    </a:stretch>
+                  </pic:blipFill>
+                  <pic:spPr bwMode="auto">
+                    <a:xfrm>
+                      <a:off x="0" y="0"/>
+                      <a:ext cx="3638550" cy="704850"/>
+                    </a:xfrm>
+                    <a:prstGeom prst="rect">
+                      <a:avLst/>
+                    </a:prstGeom>
+                  </pic:spPr>
+                </pic:pic>
+              </a:graphicData>
+            </a:graphic>
+          </wp:anchor>
+        </w:drawing>
+      </w:r>
+      <w:r>
+        <w:rPr>
+          <w:sz w:val="24"/>
+          <w:szCs w:val="27"/>
+        </w:rPr>
+        <w:t>终</w:t>
+      </w:r>
+      <w:r>
+        <w:rPr>
+          <w:sz w:val="24"/>
+          <w:szCs w:val="27"/>
+        </w:rPr>
+        <w:t>端会返回一个目录，记住这个目录，等会有用</w:t>
+      </w:r>
+    </w:p>
+    <w:p>
+      <w:pPr>
+        <w:pStyle w:val="Normal"/>
+        <w:bidi w:val="0"/>
+        <w:jc w:val="left"/>
+        <w:rPr>
+          <w:sz w:val="27"/>
+          <w:szCs w:val="27"/>
+        </w:rPr>
+      </w:pPr>
+      <w:r>
+        <w:rPr>
+          <w:sz w:val="24"/>
+          <w:szCs w:val="27"/>
+        </w:rPr>
+        <w:t>然后编辑</w:t>
+      </w:r>
+      <w:r>
+        <w:rPr>
+          <w:sz w:val="24"/>
+          <w:szCs w:val="27"/>
+        </w:rPr>
+        <w:t>main.py</w:t>
+      </w:r>
+    </w:p>
+    <w:p>
+      <w:pPr>
+        <w:pStyle w:val="Normal"/>
+        <w:bidi w:val="0"/>
+        <w:jc w:val="left"/>
+        <w:rPr>
+          <w:sz w:val="27"/>
+          <w:szCs w:val="27"/>
+        </w:rPr>
+      </w:pPr>
+      <w:r>
+        <w:rPr>
+          <w:sz w:val="24"/>
+          <w:szCs w:val="27"/>
+        </w:rPr>
+        <w:t>|</w:t>
+      </w:r>
+    </w:p>
+    <w:p>
+      <w:pPr>
+        <w:pStyle w:val="Normal"/>
+        <w:bidi w:val="0"/>
+        <w:jc w:val="left"/>
+        <w:rPr>
+          <w:sz w:val="27"/>
+          <w:szCs w:val="27"/>
+        </w:rPr>
+      </w:pPr>
+      <w:r>
+        <w:rPr>
+          <w:sz w:val="24"/>
+          <w:szCs w:val="27"/>
+        </w:rPr>
+        <w:drawing>
+          <wp:anchor behindDoc="0" distT="0" distB="0" distL="0" distR="0" simplePos="0" locked="0" layoutInCell="1" allowOverlap="1" relativeHeight="4">
+            <wp:simplePos x="0" y="0"/>
+            <wp:positionH relativeFrom="column">
+              <wp:posOffset>2487295</wp:posOffset>
+            </wp:positionH>
+            <wp:positionV relativeFrom="paragraph">
+              <wp:posOffset>139065</wp:posOffset>
+            </wp:positionV>
+            <wp:extent cx="4289425" cy="4149725"/>
+            <wp:effectExtent l="0" t="0" r="0" b="0"/>
+            <wp:wrapSquare wrapText="largest"/>
+            <wp:docPr id="3" name="图像3" descr=""/>
+            <wp:cNvGraphicFramePr>
+              <a:graphicFrameLocks xmlns:a="http://schemas.openxmlformats.org/drawingml/2006/main" noChangeAspect="1"/>
+            </wp:cNvGraphicFramePr>
+            <a:graphic xmlns:a="http://schemas.openxmlformats.org/drawingml/2006/main">
+              <a:graphicData uri="http://schemas.openxmlformats.org/drawingml/2006/picture">
+                <pic:pic xmlns:pic="http://schemas.openxmlformats.org/drawingml/2006/picture">
+                  <pic:nvPicPr>
+                    <pic:cNvPr id="3" name="图像3" descr=""/>
+                    <pic:cNvPicPr>
+                      <a:picLocks noChangeAspect="1" noChangeArrowheads="1"/>
+                    </pic:cNvPicPr>
+                  </pic:nvPicPr>
+                  <pic:blipFill>
+                    <a:blip r:embed="rId4"/>
+                    <a:stretch>
+                      <a:fillRect/>
+                    </a:stretch>
+                  </pic:blipFill>
+                  <pic:spPr bwMode="auto">
+                    <a:xfrm>
+                      <a:off x="0" y="0"/>
+                      <a:ext cx="4289425" cy="4149725"/>
+                    </a:xfrm>
+                    <a:prstGeom prst="rect">
+                      <a:avLst/>
+                    </a:prstGeom>
+                  </pic:spPr>
+                </pic:pic>
+              </a:graphicData>
+            </a:graphic>
+          </wp:anchor>
+        </w:drawing>
+      </w:r>
+      <w:r>
+        <w:rPr>
+          <w:sz w:val="24"/>
+          <w:szCs w:val="27"/>
+        </w:rPr>
+        <w:t>|</w:t>
+      </w:r>
+    </w:p>
+    <w:p>
+      <w:pPr>
+        <w:pStyle w:val="Normal"/>
+        <w:bidi w:val="0"/>
+        <w:jc w:val="left"/>
+        <w:rPr>
+          <w:sz w:val="27"/>
+          <w:szCs w:val="27"/>
+        </w:rPr>
+      </w:pPr>
+      <w:r>
+        <w:rPr>
+          <w:sz w:val="24"/>
+          <w:szCs w:val="27"/>
+        </w:rPr>
+        <w:t>|</w:t>
+      </w:r>
+    </w:p>
+    <w:p>
+      <w:pPr>
+        <w:pStyle w:val="Normal"/>
+        <w:bidi w:val="0"/>
+        <w:jc w:val="left"/>
+        <w:rPr>
+          <w:sz w:val="27"/>
+          <w:szCs w:val="27"/>
+        </w:rPr>
+      </w:pPr>
+      <w:r>
+        <w:rPr>
+          <w:sz w:val="24"/>
+          <w:szCs w:val="27"/>
+        </w:rPr>
+        <w:t>|</w:t>
+      </w:r>
+    </w:p>
+    <w:p>
+      <w:pPr>
+        <w:pStyle w:val="Normal"/>
+        <w:bidi w:val="0"/>
+        <w:jc w:val="left"/>
+        <w:rPr>
+          <w:sz w:val="27"/>
+          <w:szCs w:val="27"/>
+        </w:rPr>
+      </w:pPr>
+      <w:r>
+        <w:rPr>
+          <w:sz w:val="24"/>
+          <w:szCs w:val="27"/>
+        </w:rPr>
+        <w:t>--------------------------------</w:t>
+      </w:r>
+      <w:r>
+        <w:rPr>
+          <w:sz w:val="48"/>
+          <w:szCs w:val="48"/>
+        </w:rPr>
+        <w:t>→</w:t>
+      </w:r>
+    </w:p>
+    <w:p>
+      <w:pPr>
+        <w:pStyle w:val="Normal"/>
+        <w:bidi w:val="0"/>
+        <w:jc w:val="left"/>
+        <w:rPr>
+          <w:sz w:val="27"/>
+          <w:szCs w:val="27"/>
+        </w:rPr>
+      </w:pPr>
+      <w:r>
+        <w:rPr>
+          <w:sz w:val="24"/>
+          <w:szCs w:val="27"/>
+        </w:rPr>
+        <w:t>然后将第</w:t>
+      </w:r>
+      <w:r>
+        <w:rPr>
+          <w:sz w:val="24"/>
+          <w:szCs w:val="27"/>
+        </w:rPr>
+        <w:t>6</w:t>
+      </w:r>
+      <w:r>
+        <w:rPr>
+          <w:sz w:val="24"/>
+          <w:szCs w:val="27"/>
+        </w:rPr>
+        <w:t>行的改为</w:t>
+      </w:r>
+    </w:p>
+    <w:p>
+      <w:pPr>
+        <w:pStyle w:val="Normal"/>
+        <w:bidi w:val="0"/>
+        <w:jc w:val="left"/>
+        <w:rPr>
+          <w:sz w:val="27"/>
+          <w:szCs w:val="27"/>
+        </w:rPr>
+      </w:pPr>
+      <w:r>
+        <w:rPr>
+          <w:sz w:val="24"/>
+          <w:szCs w:val="27"/>
+        </w:rPr>
+        <w:t>runpath=”</w:t>
+      </w:r>
+      <w:r>
+        <w:rPr>
+          <w:sz w:val="24"/>
+          <w:szCs w:val="27"/>
+        </w:rPr>
+        <w:t>刚才那个目录”</w:t>
+      </w:r>
+    </w:p>
+    <w:p>
+      <w:pPr>
+        <w:pStyle w:val="Normal"/>
+        <w:bidi w:val="0"/>
+        <w:jc w:val="left"/>
+        <w:rPr>
+          <w:sz w:val="27"/>
+          <w:szCs w:val="27"/>
+        </w:rPr>
+      </w:pPr>
+      <w:r>
+        <w:rPr>
+          <w:sz w:val="24"/>
+          <w:szCs w:val="27"/>
+        </w:rPr>
+        <w:t>比如我的</w:t>
+      </w:r>
+    </w:p>
+    <w:p>
+      <w:pPr>
+        <w:pStyle w:val="Normal"/>
+        <w:bidi w:val="0"/>
+        <w:jc w:val="left"/>
+        <w:rPr>
+          <w:sz w:val="27"/>
+          <w:szCs w:val="27"/>
+        </w:rPr>
+      </w:pPr>
+      <w:r>
+        <w:rPr>
+          <w:sz w:val="24"/>
+          <w:szCs w:val="27"/>
+        </w:rPr>
+        <w:t>runpath=”/home/luoyin/webapps”</w:t>
+      </w:r>
+    </w:p>
+    <w:p>
+      <w:pPr>
+        <w:pStyle w:val="Normal"/>
+        <w:bidi w:val="0"/>
+        <w:jc w:val="left"/>
+        <w:rPr>
+          <w:sz w:val="27"/>
+          <w:szCs w:val="27"/>
+        </w:rPr>
+      </w:pPr>
+      <w:r>
+        <w:rPr/>
+      </w:r>
+    </w:p>
+    <w:p>
+      <w:pPr>
+        <w:pStyle w:val="Normal"/>
+        <w:bidi w:val="0"/>
+        <w:jc w:val="left"/>
+        <w:rPr>
+          <w:sz w:val="27"/>
+          <w:szCs w:val="27"/>
+        </w:rPr>
+      </w:pPr>
+      <w:r>
+        <w:rPr>
+          <w:sz w:val="24"/>
+          <w:szCs w:val="27"/>
+        </w:rPr>
+        <w:t>如你所见我只写了右图那一点点代码。。。。。。</w:t>
       </w:r>
     </w:p>
     <w:sectPr>

</xml_diff>